<commit_message>
Pricing clarity: flat annual fee per tier, not a % of volume
Team flagged the pricing read as ambiguous (set fee vs % of volume). Made
explicit in GTM V2.0 (Fund intro + a 'how the customer is charged' callout:
flat fee per tier; volume only selects the tier; the 0.10-0.50% is an internal
proportionality check, not a charge; never a % of disbursements) and mirrored
on the one-pager (callout + Fund heading).

Co-Authored-By: Claude Opus 4.8 <noreply@anthropic.com>
</commit_message>
<xml_diff>
--- a/docs/Kuja_GoToMarket_Strategy_V2.0.docx
+++ b/docs/Kuja_GoToMarket_Strategy_V2.0.docx
@@ -659,6 +659,49 @@
         <w:t>Value-metric hierarchy for a quote: (1) primary — annual grant volume or portfolio responsibility; (2) secondary — active organizations and applications; (3) complexity — programs, entities, countries, governance layers; (4) service — implementation, migration, SLA, residency. The primary and secondary metrics set the standard tier; complexity and service decide standard-tier versus enterprise quote.</w:t>
       </w:r>
     </w:p>
+    <w:tbl>
+      <w:tblPr>
+        <w:tblStyle w:val="TableGrid"/>
+        <w:tblW w:type="auto" w:w="0"/>
+        <w:tblLook w:firstColumn="1" w:firstRow="1" w:lastColumn="0" w:lastRow="0" w:noHBand="0" w:noVBand="1" w:val="04A0"/>
+      </w:tblPr>
+      <w:tblGrid>
+        <w:gridCol w:w="9792"/>
+      </w:tblGrid>
+      <w:tr>
+        <w:tc>
+          <w:tcPr>
+            <w:tcW w:type="dxa" w:w="9792"/>
+            <w:shd w:val="clear" w:fill="FBEDE6"/>
+          </w:tcPr>
+          <w:p>
+            <w:r/>
+            <w:r>
+              <w:rPr>
+                <w:rFonts w:ascii="Georgia" w:hAnsi="Georgia"/>
+                <w:b/>
+                <w:color w:val="C2410C"/>
+                <w:sz w:val="19"/>
+              </w:rPr>
+              <w:t xml:space="preserve">How the customer is charged:  </w:t>
+            </w:r>
+            <w:r>
+              <w:rPr>
+                <w:rFonts w:ascii="Georgia" w:hAnsi="Georgia"/>
+                <w:color w:val="1A1410"/>
+                <w:sz w:val="19"/>
+              </w:rPr>
+              <w:t>a FLAT annual fee per tier — not a percentage of anything. Grant volume (or orgs relied on, or org size) only selects which tier the customer falls into; the price they pay is the fixed tier price. Kuja never charges a live percentage of grants or a percentage of disbursements — that would read as taxing the aid.</w:t>
+            </w:r>
+          </w:p>
+        </w:tc>
+      </w:tr>
+    </w:tbl>
+    <w:p>
+      <w:pPr>
+        <w:spacing w:after="20"/>
+      </w:pPr>
+    </w:p>
     <w:p>
       <w:pPr>
         <w:spacing w:after="120"/>
@@ -671,7 +714,7 @@
           <w:color w:val="57534E"/>
           <w:sz w:val="19"/>
         </w:rPr>
-        <w:t>A guardrail worth stating: for standard tiers, the annual subscription should sit between 0.10% and 0.50% of the grant volume it manages. Below that we leave value uncaptured; above it, a small fund perceives software as competing with program spend.</w:t>
+        <w:t>The one place a percentage appears is an internal proportionality check, NOT a charge: for standard tiers the flat fee should land between 0.10% and 0.50% of the grant volume it manages. Below that we are leaving value uncaptured; above it, a small fund perceives software as competing with program spend. We use it to sanity-check where a tier sits, not to bill the customer.</w:t>
       </w:r>
     </w:p>
     <w:p>
@@ -2168,7 +2211,7 @@
           <w:color w:val="1A1410"/>
           <w:sz w:val="20"/>
         </w:rPr>
-        <w:t>USD, annual, unlimited users, funder-paid, NGOs free. Priced by grant volume. Anchored to Plinth (~£2.5k/£7.5k/£15k) and Foundant GLM ($6.5k/$9.9k/$13.9k); Kuja enters near their lower/middle bands and charges more only as portfolio complexity and network value rise.</w:t>
+        <w:t>USD, annual, unlimited users, funder-paid, NGOs free. The customer pays the FLAT price of the tier they fall into — grant volume selects the tier, it is not a percentage they are billed. Anchored to Plinth (~£2.5k/£7.5k/£15k) and Foundant GLM ($6.5k/$9.9k/$13.9k); Kuja enters near their lower/middle bands and charges more only as portfolio complexity and network value rise. Example: a fund managing ~$4M lands in Growth and pays a flat $16,000 — and moves to Portfolio ($32,000) at renewal only if it grows past the Growth ceiling.</w:t>
       </w:r>
     </w:p>
     <w:tbl>

</xml_diff>